<commit_message>
Add DSS6 audit review (run 20260924-3f723d0d)
Review of the Decolure Satin Sheets 6 Piece maintenance run and its stored
review, with every swap, re-point, colour pause, fold survivor and build judged
on the inventory planner, and each rank freeze read on the daily crawl.
Alternatives now count their inbound; due swaps name the preferred target in
all four reviews' swap tables.

Co-Authored-By: Claude Opus 5.5 <noreply@anthropic.com>
Claude-Session: https://claude.ai/code/session_01ECNUyLvUafHehET6NevFNz
</commit_message>
<xml_diff>
--- a/docs/reviews/DSS4_Audit_Review_20260924-d38957cf.docx
+++ b/docs/reviews/DSS4_Audit_Review_20260924-d38957cf.docx
@@ -13695,7 +13695,7 @@
                 <w:sz w:val="16"/>
                 <w:szCs w:val="16"/>
               </w:rPr>
-              <w:t xml:space="preserve">Do by hand</w:t>
+              <w:t xml:space="preserve">Do by hand, to SATIN-KING-BLACK</w:t>
             </w:r>
           </w:p>
         </w:tc>
@@ -17231,7 +17231,7 @@
           <w:sz w:val="17"/>
           <w:szCs w:val="17"/>
         </w:rPr>
-        <w:t xml:space="preserve">Cover after = target FBA ÷ (target’s own sales a day + the 14-day ad orders a day of every live campaign moving onto it from a child that is out or at risk). A swap passes only when the source is out or at risk, the target is the same size and pack, carries the keyword’s colour, and keeps 30+ days. An alternative is named only when it keeps 45+ days. Source: Sellerboard inventory planner, Amazon.com, pulled 25 Sep 2026 (FBA stock, reserved, inbound, sales velocity, days of stock left, running-out flag); Command Center campaign report, last 14 days.</w:t>
+        <w:t xml:space="preserve">Cover after = target FBA ÷ (target’s own sales a day + the 14-day ad orders a day of every live campaign moving onto it from a child that is out or at risk). A swap passes only when the source is out or at risk, the target is the same size and pack, carries the keyword’s colour, and keeps 30+ days. An alternative is named only when it keeps 45+ days, counting its inbound. Source: Sellerboard inventory planner, Amazon.com, pulled 25 Sep 2026 (FBA stock, reserved, inbound, sales velocity, days of stock left, running-out flag); Command Center campaign report, last 14 days.</w:t>
       </w:r>
     </w:p>
     <w:p>

</xml_diff>